<commit_message>
Prior-art: record the Wayback archival snapshot in sec6 + table
Captured https://web.archive.org/web/20260702211034/https://thalyn.world/prior-art/
after the IP.com-claim fix went live. Regenerated the PDF/docx to match.
</commit_message>
<xml_diff>
--- a/prior-art/Thalyn_Defensive_Publication_Jul2026.docx
+++ b/prior-art/Thalyn_Defensive_Publication_Jul2026.docx
@@ -875,7 +875,7 @@
           <w:b w:val="0"/>
           <w:i w:val="0"/>
         </w:rPr>
-        <w:t>This document is published openly and without restriction at the permanent URL below by Thalyn Ltd, United Kingdom, and is intended to be publicly accessible and discoverable by patent examiners worldwide. It is additionally being deposited on Technical Disclosure Commons (tdcommons.org), a free repository for defensive publications that is indexed and surfaced by Google Patents; the deposit is in progress and the assigned ID/URL will be recorded in the table below on receipt. An independent, timestamped archival snapshot of this page is maintained via the Internet Archive Wayback Machine, recorded below on capture.</w:t>
+        <w:t>This document is published openly and without restriction at the permanent URL below by Thalyn Ltd, United Kingdom, and is intended to be publicly accessible and discoverable by patent examiners worldwide. It is additionally being deposited on Technical Disclosure Commons (tdcommons.org), a free repository for defensive publications that is indexed and surfaced by Google Patents; the deposit is in progress and the assigned ID/URL will be recorded in the table below on receipt. An independent, timestamped archival snapshot of this page is maintained via the Internet Archive Wayback Machine (recorded below).</w:t>
       </w:r>
     </w:p>
     <w:p>
@@ -1019,9 +1019,19 @@
               <w:rPr>
                 <w:b w:val="0"/>
                 <w:i w:val="0"/>
+                <w:color w:val="6B551A"/>
+                <w:sz w:val="20"/>
+                <w:u w:val="single"/>
+              </w:rPr>
+              <w:t>web.archive.org/web/20260702211034/thalyn.world/prior-art</w:t>
+            </w:r>
+            <w:r>
+              <w:rPr>
+                <w:b w:val="0"/>
+                <w:i w:val="0"/>
                 <w:sz w:val="20"/>
               </w:rPr>
-              <w:t>Internet Archive Wayback Machine — to be recorded here on capture</w:t>
+              <w:t xml:space="preserve"> (captured 2 July 2026)</w:t>
             </w:r>
           </w:p>
         </w:tc>

</xml_diff>

<commit_message>
Prior-art: pull specific physics-sim technique/parameter names out of sec 3.2/3.9
3.2 and 3.9 named the actual simulation families (spring-mass, elastic
membrane, particle settlement) and the actual tunable parameters
(stiffness, damping, force distribution, settlement duration). None of
that is inferable from the shipped product or marketing - it's pure
internal trade secret, undiscoverable client-side per 3.8's own
architecture - so naming it bought no defensive value (a broad "physics
simulation parameterised by an emotional profile" claim is already
blocked without naming which physics) while handing away a real,
actionable implementation detail for free. It also contradicted sec 6's
own promise that "specific algorithmic parameters ... remain proprietary
and are not disclosed herein." Sec 5's scope-list summaries for (2)/(9)
were already written at the correct altitude and needed no change.
Regenerated the PDF/docx to match.
</commit_message>
<xml_diff>
--- a/prior-art/Thalyn_Defensive_Publication_Jul2026.docx
+++ b/prior-art/Thalyn_Defensive_Publication_Jul2026.docx
@@ -289,7 +289,7 @@
           <w:b w:val="0"/>
           <w:i w:val="0"/>
         </w:rPr>
-        <w:t>Systems in which terrain topology is generated by physics-based simulation — including but not limited to spring-mass, elastic membrane, or particle settlement simulations — whose parameters (stiffness, damping, force distribution, settlement duration) are derived from a multi-dimensional emotional profile vector grounded in environmental psychology research. The emotional profile determines the macro-topology character of the resulting terrain without prescribing specific geometric forms.</w:t>
+        <w:t>Systems in which terrain topology is generated by a physics-based simulation whose governing parameters are derived from a multi-dimensional emotional profile vector grounded in environmental psychology research. The emotional profile determines the macro-topology character of the resulting terrain without prescribing specific geometric forms. The specific simulation method and its governing parameters are not disclosed herein.</w:t>
       </w:r>
     </w:p>
     <w:p>
@@ -464,7 +464,7 @@
           <w:b w:val="0"/>
           <w:i w:val="0"/>
         </w:rPr>
-        <w:t>Terrain generation systems in which surface continuity and walkability are guaranteed as mathematical properties of an emotionally-parameterised physics-based simulation, rather than enforced by post-processing correction applied to independently generated geometry. The emotional profile parameters that govern the simulation's physical properties — stiffness, damping, force distribution — are constrained such that the resulting geometry is provably traversable without requiring a separate walkability pass or navigation mesh correction step.</w:t>
+        <w:t>Terrain generation systems in which surface continuity and walkability are guaranteed as mathematical properties of an emotionally-parameterised physics-based simulation, rather than enforced by post-processing correction applied to independently generated geometry. The simulation's governing parameters are constrained such that the resulting geometry is provably traversable without requiring a separate walkability pass or navigation mesh correction step. The specific constraint mechanism is not disclosed herein.</w:t>
       </w:r>
     </w:p>
     <w:p>

</xml_diff>